<commit_message>
Checkpoint before full-site QA audit fixes.
Preserves complex-topics sidebar navigation, competition media cleanup, obsolete asset removal, and pending scientist/CV update WIP.

Co-authored-by: Cursor <cursoragent@cursor.com>
</commit_message>
<xml_diff>
--- a/az/scientists/CV/Word/Abdullayev_Azer_CV_AZ.docx
+++ b/az/scientists/CV/Word/Abdullayev_Azer_CV_AZ.docx
@@ -377,7 +377,7 @@
           <w:sz w:val="21"/>
           <w:szCs w:val="21"/>
         </w:rPr>
-        <w:t>Azər Abdullayev 2004-cü ildən Səudiyyə Ərəbistanının Cizan şəhərindəki Kral Fahad və Sabya xəstəxanalarında ortoped-cərrah konsultant və şöbə müdiridir. 1972-ci ildə Azərbaycan Tibb Universitetinə daxil olub, 1979-cu ildə cərrahiyyə ixtisası üzrə internaturanı bitirib. 1989-cu ildə tibb elmləri namizədi, 2012-ci ildə tibb elmləri doktoru dərəcəsi alıb. 1979–1989-cu illərdə Şərur Mərkəzi Xəstəxanasında travmatoloq-ortoped, 1989–2004-cü illərdə Azərbaycan Tibb Universitetinin travmatologiya və ortopediya kafedrasında çalışıb. CV-də altı patent və ya müəllif şəhadətnaməsi, o cümlədən xarici fiksasiya aparatı, kompressiyaedici ştift və məlhəm təsvir olunur.</w:t>
+        <w:t>Azər Abdullayev 2004-cü ildən Səudiyyə Ərəbistanının Cizan şəhərindəki Kral Fahad və Sabya xəstəxanalarında ortoped-cərrah konsultant və şöbə müdiridir. 1972-ci ildə Azərbaycan Tibb Universitetinə daxil olub, 1979-cu ildə cərrahiyyə ixtisası üzrə internaturanı bitirib. 1989-cu ildə tibb elmləri namizədi, 2012-ci ildə tibb elmləri doktoru dərəcəsi alıb. 1979–1989-cu illərdə Şərur Mərkəzi Xəstəxanasında travmatoloq-ortoped, 1989–2004-cü illərdə Azərbaycan Tibb Universitetinin travmatologiya və ortopediya kafedrasında çalışıb.Altı patent və ya müəllif şəhadətnaməsi var, o cümlədən xarici fiksasiya aparatı, kompressiyaedici ştift və məlhəm təsvir olunur.</w:t>
       </w:r>
     </w:p>
     <w:p>
@@ -1615,7 +1615,7 @@
                 <w:sz w:val="21"/>
                 <w:szCs w:val="21"/>
               </w:rPr>
-              <w:t>CV</w:t>
+              <w:t>Özü tərəfindən</w:t>
             </w:r>
           </w:p>
         </w:tc>

</xml_diff>